<commit_message>
fix: updated both cty BEO templates and SQL function
</commit_message>
<xml_diff>
--- a/backend-app/samples/BEO TIEC CTY - Thay Doi.docx
+++ b/backend-app/samples/BEO TIEC CTY - Thay Doi.docx
@@ -2875,38 +2875,18 @@
           </w:p>
           <w:p>
             <w:pPr>
-              <w:pStyle w:val="TableParagraph"/>
-              <w:rPr>
-                <w:sz w:val="10"/>
-              </w:rPr>
-            </w:pPr>
-            <w:r>
-              <w:rPr>
-                <w:sz w:val="10"/>
-              </w:rPr>
-              <w:t xml:space="preserve">{TenDichVu} | </w:t>
-            </w:r>
-            <w:r>
-              <w:rPr>
-                <w:sz w:val="10"/>
-              </w:rPr>
-              <w:t>{SoLuongText}</w:t>
-            </w:r>
-            <w:r>
-              <w:rPr>
-                <w:strike w:val="true"/>
-                <w:color w:val="FF0000"/>
-              </w:rPr>
-              <w:t xml:space="preserve"> {#SoLuongText_Cu}~~{SoLuongText_Cu}~~{/SoLuongText_Cu}</w:t>
-            </w:r>
-            <w:r>
-              <w:t xml:space="preserve"/>
-            </w:r>
-            <w:r>
-              <w:rPr>
-                <w:sz w:val="10"/>
-              </w:rPr>
-              <w:t>{GhiChu} | Đơn giá: {DonGia} | Thành tiền: {ThanhTien}</w:t>
+              <w:spacing w:before="15"/>
+              <w:rPr>
+                <w:sz w:val="20"/>
+                <w:lang w:val="en-US"/>
+              </w:rPr>
+            </w:pPr>
+            <w:r>
+              <w:rPr>
+                <w:sz w:val="20"/>
+                <w:lang w:val="en-US"/>
+              </w:rPr>
+              <w:t>{DichVuText}</w:t>
             </w:r>
           </w:p>
           <w:p>

</xml_diff>